<commit_message>
feat - adding bug 1 from the uf ece website
</commit_message>
<xml_diff>
--- a/BugReporting/QA Bug Report Sheet.docx
+++ b/BugReporting/QA Bug Report Sheet.docx
@@ -104,7 +104,7 @@
           <w:sz w:val="32"/>
           <w:szCs w:val="32"/>
         </w:rPr>
-        <w:t xml:space="preserve">Browser &amp; Version: </w:t>
+        <w:t xml:space="preserve">Browser: </w:t>
       </w:r>
     </w:p>
     <w:p>
@@ -150,7 +150,25 @@
           <w:sz w:val="32"/>
           <w:szCs w:val="32"/>
         </w:rPr>
-        <w:t xml:space="preserve">Website / Page: </w:t>
+        <w:t>Website</w:t>
+      </w:r>
+      <w:r>
+        <w:rPr>
+          <w:b/>
+          <w:bCs/>
+          <w:sz w:val="32"/>
+          <w:szCs w:val="32"/>
+        </w:rPr>
+        <w:t xml:space="preserve"> Link</w:t>
+      </w:r>
+      <w:r>
+        <w:rPr>
+          <w:b/>
+          <w:bCs/>
+          <w:sz w:val="32"/>
+          <w:szCs w:val="32"/>
+        </w:rPr>
+        <w:t xml:space="preserve">: </w:t>
       </w:r>
     </w:p>
     <w:p>
@@ -249,7 +267,6 @@
         </w:rPr>
         <w:t xml:space="preserve"> | </w:t>
       </w:r>
-      <w:proofErr w:type="gramStart"/>
       <w:r>
         <w:rPr>
           <w:b/>
@@ -272,7 +289,6 @@
         </w:rPr>
         <w:t xml:space="preserve"> ]</w:t>
       </w:r>
-      <w:proofErr w:type="gramEnd"/>
       <w:r>
         <w:rPr>
           <w:b/>
@@ -314,21 +330,8 @@
           <w:sz w:val="32"/>
           <w:szCs w:val="32"/>
         </w:rPr>
-        <w:t xml:space="preserve">[ High | Medium | </w:t>
-      </w:r>
-      <w:proofErr w:type="gramStart"/>
-      <w:r>
-        <w:rPr>
-          <w:b/>
-          <w:bCs/>
-          <w:i/>
-          <w:iCs/>
-          <w:sz w:val="32"/>
-          <w:szCs w:val="32"/>
-        </w:rPr>
-        <w:t>Low ]</w:t>
-      </w:r>
-      <w:proofErr w:type="gramEnd"/>
+        <w:t>[ High | Medium | Low ]</w:t>
+      </w:r>
       <w:r>
         <w:rPr>
           <w:b/>
@@ -370,21 +373,8 @@
           <w:sz w:val="32"/>
           <w:szCs w:val="32"/>
         </w:rPr>
-        <w:t xml:space="preserve">[ Functional | Visual | Content | Performance | </w:t>
-      </w:r>
-      <w:proofErr w:type="gramStart"/>
-      <w:r>
-        <w:rPr>
-          <w:b/>
-          <w:bCs/>
-          <w:i/>
-          <w:iCs/>
-          <w:sz w:val="32"/>
-          <w:szCs w:val="32"/>
-        </w:rPr>
-        <w:t>Crash ]</w:t>
-      </w:r>
-      <w:proofErr w:type="gramEnd"/>
+        <w:t>[ Functional | Visual | Content | Performance | Crash ]</w:t>
+      </w:r>
       <w:r>
         <w:rPr>
           <w:b/>
@@ -426,21 +416,8 @@
           <w:sz w:val="32"/>
           <w:szCs w:val="32"/>
         </w:rPr>
-        <w:t xml:space="preserve">[ Always | Often | Sometimes | Rarely | </w:t>
-      </w:r>
-      <w:proofErr w:type="gramStart"/>
-      <w:r>
-        <w:rPr>
-          <w:b/>
-          <w:bCs/>
-          <w:i/>
-          <w:iCs/>
-          <w:sz w:val="32"/>
-          <w:szCs w:val="32"/>
-        </w:rPr>
-        <w:t>Once ]</w:t>
-      </w:r>
-      <w:proofErr w:type="gramEnd"/>
+        <w:t>[ Always | Often | Sometimes | Rarely | Once ]</w:t>
+      </w:r>
       <w:r>
         <w:rPr>
           <w:b/>
@@ -3231,6 +3208,7 @@
   <w:style w:type="character" w:default="1" w:styleId="DefaultParagraphFont">
     <w:name w:val="Default Paragraph Font"/>
     <w:uiPriority w:val="1"/>
+    <w:semiHidden/>
     <w:unhideWhenUsed/>
   </w:style>
   <w:style w:type="table" w:default="1" w:styleId="TableNormal">

</xml_diff>

<commit_message>
feat - added  bug report 2 for the ece page
</commit_message>
<xml_diff>
--- a/BugReporting/QA Bug Report Sheet.docx
+++ b/BugReporting/QA Bug Report Sheet.docx
@@ -83,6 +83,15 @@
         </w:rPr>
         <w:t xml:space="preserve">OS: </w:t>
       </w:r>
+      <w:r>
+        <w:rPr>
+          <w:b/>
+          <w:bCs/>
+          <w:sz w:val="32"/>
+          <w:szCs w:val="32"/>
+        </w:rPr>
+        <w:t>Windows 11 Pro</w:t>
+      </w:r>
     </w:p>
     <w:p>
       <w:pPr>
@@ -106,6 +115,15 @@
         </w:rPr>
         <w:t xml:space="preserve">Browser: </w:t>
       </w:r>
+      <w:r>
+        <w:rPr>
+          <w:b/>
+          <w:bCs/>
+          <w:sz w:val="32"/>
+          <w:szCs w:val="32"/>
+        </w:rPr>
+        <w:t>Google</w:t>
+      </w:r>
     </w:p>
     <w:p>
       <w:pPr>
@@ -129,6 +147,33 @@
         </w:rPr>
         <w:t xml:space="preserve">Screen Resolution: </w:t>
       </w:r>
+      <w:r>
+        <w:rPr>
+          <w:b/>
+          <w:bCs/>
+          <w:sz w:val="32"/>
+          <w:szCs w:val="32"/>
+        </w:rPr>
+        <w:t xml:space="preserve">1920x1200 </w:t>
+      </w:r>
+      <w:r>
+        <w:rPr>
+          <w:b/>
+          <w:bCs/>
+          <w:sz w:val="32"/>
+          <w:szCs w:val="32"/>
+        </w:rPr>
+        <w:t>at</w:t>
+      </w:r>
+      <w:r>
+        <w:rPr>
+          <w:b/>
+          <w:bCs/>
+          <w:sz w:val="32"/>
+          <w:szCs w:val="32"/>
+        </w:rPr>
+        <w:t xml:space="preserve"> 150% scale</w:t>
+      </w:r>
     </w:p>
     <w:p>
       <w:pPr>
@@ -627,117 +672,6 @@
         </w:rPr>
         <w:lastRenderedPageBreak/>
         <w:t xml:space="preserve">Screenshots: </w:t>
-      </w:r>
-    </w:p>
-    <w:p>
-      <w:pPr>
-        <w:numPr>
-          <w:ilvl w:val="0"/>
-          <w:numId w:val="12"/>
-        </w:numPr>
-        <w:rPr>
-          <w:b/>
-          <w:bCs/>
-          <w:sz w:val="32"/>
-          <w:szCs w:val="32"/>
-        </w:rPr>
-      </w:pPr>
-      <w:r>
-        <w:rPr>
-          <w:b/>
-          <w:bCs/>
-          <w:sz w:val="32"/>
-          <w:szCs w:val="32"/>
-        </w:rPr>
-        <w:t xml:space="preserve">Screen Recording: </w:t>
-      </w:r>
-    </w:p>
-    <w:p>
-      <w:pPr>
-        <w:numPr>
-          <w:ilvl w:val="0"/>
-          <w:numId w:val="12"/>
-        </w:numPr>
-        <w:rPr>
-          <w:b/>
-          <w:bCs/>
-          <w:sz w:val="32"/>
-          <w:szCs w:val="32"/>
-        </w:rPr>
-      </w:pPr>
-      <w:r>
-        <w:rPr>
-          <w:b/>
-          <w:bCs/>
-          <w:sz w:val="32"/>
-          <w:szCs w:val="32"/>
-        </w:rPr>
-        <w:t xml:space="preserve">Console Logs: </w:t>
-      </w:r>
-    </w:p>
-    <w:p>
-      <w:pPr>
-        <w:numPr>
-          <w:ilvl w:val="0"/>
-          <w:numId w:val="12"/>
-        </w:numPr>
-        <w:rPr>
-          <w:b/>
-          <w:bCs/>
-          <w:sz w:val="32"/>
-          <w:szCs w:val="32"/>
-        </w:rPr>
-      </w:pPr>
-      <w:r>
-        <w:rPr>
-          <w:b/>
-          <w:bCs/>
-          <w:sz w:val="32"/>
-          <w:szCs w:val="32"/>
-        </w:rPr>
-        <w:t xml:space="preserve">Other Evidence: </w:t>
-      </w:r>
-    </w:p>
-    <w:p>
-      <w:pPr>
-        <w:rPr>
-          <w:b/>
-          <w:bCs/>
-          <w:sz w:val="32"/>
-          <w:szCs w:val="32"/>
-        </w:rPr>
-      </w:pPr>
-      <w:r>
-        <w:rPr>
-          <w:b/>
-          <w:bCs/>
-          <w:sz w:val="32"/>
-          <w:szCs w:val="32"/>
-        </w:rPr>
-        <w:t>7. Additional Information</w:t>
-      </w:r>
-    </w:p>
-    <w:p>
-      <w:pPr>
-        <w:numPr>
-          <w:ilvl w:val="0"/>
-          <w:numId w:val="13"/>
-        </w:numPr>
-        <w:rPr>
-          <w:b/>
-          <w:bCs/>
-          <w:sz w:val="32"/>
-          <w:szCs w:val="32"/>
-        </w:rPr>
-      </w:pPr>
-      <w:r>
-        <w:rPr>
-          <w:b/>
-          <w:bCs/>
-          <w:sz w:val="32"/>
-          <w:szCs w:val="32"/>
-        </w:rPr>
-        <w:t>Additional Notes:</w:t>
       </w:r>
     </w:p>
     <w:p>

</xml_diff>